<commit_message>
crear proyecto inicial, movimineto y redenrizado basico de los vehiculos
</commit_message>
<xml_diff>
--- a/momento 2.docx
+++ b/momento 2.docx
@@ -1325,7 +1325,112 @@
     <w:p/>
     <w:p>
       <w:r>
-        <w:t>En este nivel habrán un par de objetos que ayudaran al vehículo que los recoja, uno será una suspensión especial que hará que el vehículo pase un 30% mas de tiempo en el aire y el otro será un escudo de chatarra que hará que el vehículo no se vea afectado por las explosiones, ambos objetos funcionaran por un tiempo predefinido</w:t>
+        <w:t xml:space="preserve">En este nivel </w:t>
+      </w:r>
+      <w:proofErr w:type="gramStart"/>
+      <w:r>
+        <w:t>habrán</w:t>
+      </w:r>
+      <w:proofErr w:type="gramEnd"/>
+      <w:r>
+        <w:t xml:space="preserve"> un par de objetos que ayudaran al vehículo que los recoja, uno será una suspensión especial que hará que el vehículo pase un 30% mas de tiempo en el aire y el otro será un escudo de chatarra que hará que el vehículo no se vea afectado por las explosiones, ambos objetos funcionaran por un tiempo predefinido</w:t>
+      </w:r>
+    </w:p>
+    <w:p>
+      <w:pPr>
+        <w:rPr>
+          <w:b/>
+          <w:bCs/>
+        </w:rPr>
+      </w:pPr>
+      <w:r>
+        <w:rPr>
+          <w:b/>
+          <w:bCs/>
+        </w:rPr>
+        <w:t>Agente IA:</w:t>
+      </w:r>
+    </w:p>
+    <w:p>
+      <w:r>
+        <w:lastRenderedPageBreak/>
+        <w:t xml:space="preserve">El agente observa el estado actual del nivel en cada ciclo de actualización. Recopila la posición propia del vehículo que controla, el carril que ocupa el jugador, los obstáculos activos y en qué carril se encuentran, los </w:t>
+      </w:r>
+      <w:proofErr w:type="spellStart"/>
+      <w:r>
+        <w:t>power</w:t>
+      </w:r>
+      <w:proofErr w:type="spellEnd"/>
+      <w:r>
+        <w:t>-ups disponibles, y el tipo de terreno presente en cada carril. Con esta información construye un mapa de peligro por carril: a cada uno de los seis carriles le asigna un valor numérico que refleja qué tan riesgoso es moverse hacia él en ese momento.</w:t>
+      </w:r>
+    </w:p>
+    <w:p>
+      <w:r>
+        <w:rPr>
+          <w:b/>
+          <w:bCs/>
+        </w:rPr>
+        <w:t>Toma de decisiones</w:t>
+      </w:r>
+    </w:p>
+    <w:p>
+      <w:r>
+        <w:t xml:space="preserve">Con el mapa de peligro calculado, el agente compara su carril actual con los carriles adyacentes y determina si debe quedarse o moverse. Si el carril actual tiene un obstáculo inminente, busca el carril vecino con menor peligro y se mueve hacia él. Si el jugador está en un carril adyacente y el agente tiene espacio para acorralarlo contra un borde, lo hace siempre que eso no aumente su propio riesgo. El agente también evalúa si vale la pena recoger un </w:t>
+      </w:r>
+      <w:proofErr w:type="spellStart"/>
+      <w:r>
+        <w:t>power</w:t>
+      </w:r>
+      <w:proofErr w:type="spellEnd"/>
+      <w:r>
+        <w:t>-up visible, priorizando el escudo si hay una explosión próxima y la suspensión si hay una rampa adelante.</w:t>
+      </w:r>
+    </w:p>
+    <w:p>
+      <w:r>
+        <w:rPr>
+          <w:b/>
+          <w:bCs/>
+        </w:rPr>
+        <w:t>Acción</w:t>
+      </w:r>
+    </w:p>
+    <w:p>
+      <w:r>
+        <w:t>Una vez tomada la decisión, el agente ejecuta el movimiento lateral llamando al mismo método que usa el jugador (</w:t>
+      </w:r>
+      <w:proofErr w:type="spellStart"/>
+      <w:r>
+        <w:t>moverLateral</w:t>
+      </w:r>
+      <w:proofErr w:type="spellEnd"/>
+      <w:r>
+        <w:t xml:space="preserve">), lo que garantiza que las mismas físicas y penalizaciones aplican para ambos. El agente no tiene ventaja sobre el jugador en términos de velocidad de reacción; simplemente actúa una vez por ciclo de actualización igual que el input del jugador se procesa una vez por </w:t>
+      </w:r>
+      <w:proofErr w:type="spellStart"/>
+      <w:proofErr w:type="gramStart"/>
+      <w:r>
+        <w:t>frame</w:t>
+      </w:r>
+      <w:proofErr w:type="spellEnd"/>
+      <w:proofErr w:type="gramEnd"/>
+      <w:r>
+        <w:t>.</w:t>
+      </w:r>
+    </w:p>
+    <w:p>
+      <w:r>
+        <w:rPr>
+          <w:b/>
+          <w:bCs/>
+        </w:rPr>
+        <w:t>Dificultad</w:t>
+      </w:r>
+    </w:p>
+    <w:p>
+      <w:r>
+        <w:t>El agente tiene un parámetro de dificultad que afecta dos cosas: la frecuencia con la que actualiza su percepción (en dificultad baja percibe cada varios ciclos, simulando reacciones más lentas) y la agresividad con la que intenta acorralar al jugador (en dificultad baja ignora al jugador y solo esquiva obstáculos; en dificultad alta también lo persigue activamente).</w:t>
       </w:r>
     </w:p>
     <w:p/>

</xml_diff>